<commit_message>
Symposium poster rev 4: required sections, plain language, presenter notes
Co-Authored-By: Claude Fable 5.1 <noreply@anthropic.com>
</commit_message>
<xml_diff>
--- a/OUR/Final/Symposium Abstract - Cuenco.docx
+++ b/OUR/Final/Symposium Abstract - Cuenco.docx
@@ -72,7 +72,7 @@
           <w:sz w:val="24"/>
           <w:szCs w:val="24"/>
         </w:rPr>
-        <w:t xml:space="preserve">Students in UNLV’s introductory C++ (CS 135) and x86-64 assembly (CS 218) courses lose the first week of the semester installing a compiler, assembler, debugger, and editor on dozens of different laptops, and owners of Apple Silicon Macs often cannot run the course virtual machine at all. This project packages each course’s exact toolchain and a browser-served Visual Studio Code editor into a Docker image that runs entirely on the student’s own machine: one 552 MB download, one command, no server, no account, no telemetry. The fellowship asked whether that promise holds on the computers students actually own, and what the design gives up compared with shared SSH servers, course virtual machines, cloud editors such as CS50 on GitHub Codespaces, and monitored platforms such as CodeDive. One unmodified test script performed a student’s first day and then built and ran four real CS 218 assignments on four hosts: Intel Linux and ARM Linux rented from AWS, Windows 11 rented from Azure, and an M1 MacBook Pro. The same image ran every assignment correctly on all four, started in 0.5 s natively and 5–7 s under emulation, and idled at 55–260 MiB. The one limit is precise: the gdb debugger works on Intel/AMD hosts and is silent under both ARM translation layers, a trade made deliberately to keep the course’s real x86-64 instruction set. A classroom study is the next step.</w:t>
+        <w:t xml:space="preserve">UNLV’s introductory C++ and x86-64 assembly courses lose their first week to software setup, and the newest Macs often cannot run the course’s virtual machine. This project packages each course’s exact tools and a browser-based editor into a Docker container that runs entirely on the student’s laptop: one 552 MB download, one command, no server, no account. To test whether that promise holds on the laptops students actually own, one unmodified script performed a student’s first day and four real assignments on four machines: Intel and ARM Linux rented from AWS, Windows 11 rented from Azure, and an M1 MacBook Pro. All four passed every assignment; the editor opened in 0.5 s on Intel chips and about 5 s on Apple Silicon. The one limit, the debugger on ARM chips, is documented and explained.</w:t>
       </w:r>
     </w:p>
     <w:p>
@@ -86,7 +86,7 @@
           <w:sz w:val="20"/>
           <w:szCs w:val="20"/>
         </w:rPr>
-        <w:t xml:space="preserve">(230 words)</w:t>
+        <w:t xml:space="preserve">(134 words)</w:t>
       </w:r>
     </w:p>
     <w:sectPr>

</xml_diff>